<commit_message>
Word : accentuation de tous les DOCX, réalisés cumulatifs du fil rouge Procédure (styles→TDM→mise en page→tableau, avec table des matières automatique, en-tête/pied et tableaux), consignes en italique
Co-authored-by: BUSSERS, Charles <lesgloutonnes@users.noreply.github.com>
</commit_message>
<xml_diff>
--- a/Word/Module 1/DOCX/Exercices/01_Exercice_Texte_brut_Procedure_accueil.docx
+++ b/Word/Module 1/DOCX/Exercices/01_Exercice_Texte_brut_Procedure_accueil.docx
@@ -4,32 +4,32 @@
   <w:body>
     <w:p>
       <w:r>
-        <w:t>Procedure interne - Accueil d'un nouveau collaborateur</w:t>
+        <w:t>Procédure interne - Accueil d'un nouveau collaborateur</w:t>
       </w:r>
     </w:p>
     <w:p>
       <w:r>
-        <w:t>avant l'arrivee</w:t>
+        <w:t>avant l'arrivée</w:t>
       </w:r>
     </w:p>
     <w:p>
       <w:r>
-        <w:t>preparer les acces</w:t>
+        <w:t>préparer les accès</w:t>
       </w:r>
     </w:p>
     <w:p>
       <w:r>
-        <w:t>le responsable verifie que les demandes d'acces sont introduites avant l'arrivee du collaborateur</w:t>
+        <w:t>le responsable vérifie que les demandes d'accès sont introduites avant l'arrivée du collaborateur</w:t>
       </w:r>
     </w:p>
     <w:p>
       <w:r>
-        <w:t>preparer le materiel</w:t>
+        <w:t>préparer le matériel</w:t>
       </w:r>
     </w:p>
     <w:p>
       <w:r>
-        <w:t>le poste de travail, le badge et les informations utiles sont prepares</w:t>
+        <w:t>le poste de travail, le badge et les informations utiles sont préparés</w:t>
       </w:r>
     </w:p>
     <w:p>
@@ -39,22 +39,22 @@
     </w:p>
     <w:p>
       <w:r>
-        <w:t>accueil dans l'equipe</w:t>
+        <w:t>accueil dans l'équipe</w:t>
       </w:r>
     </w:p>
     <w:p>
       <w:r>
-        <w:t>presentation des outils</w:t>
+        <w:t>présentation des outils</w:t>
       </w:r>
     </w:p>
     <w:p>
       <w:r>
-        <w:t>les outils principaux sont : session Windows, messagerie, intranet, dossiers partages</w:t>
+        <w:t>les outils principaux sont : session Windows, messagerie, intranet, dossiers partagés</w:t>
       </w:r>
     </w:p>
     <w:p>
       <w:r>
-        <w:t>apres la premiere semaine</w:t>
+        <w:t>après la première semaine</w:t>
       </w:r>
     </w:p>
     <w:p>
@@ -64,7 +64,7 @@
     </w:p>
     <w:p>
       <w:r>
-        <w:t>ajustements eventuels</w:t>
+        <w:t>ajustements éventuels</w:t>
       </w:r>
     </w:p>
     <w:p>
@@ -72,7 +72,7 @@
         <w:rPr>
           <w:i/>
         </w:rPr>
-        <w:t>Consigne : appliquez le style Titre au titre principal, puis Titre 1 aux grandes parties, Titre 2 aux sous-parties et Normal au texte. Transformez l'enumeration des outils en liste a puces, encadrez le titre principal (bordure + trame legere) et utilisez le pinceau (Reproduire la mise en forme) pour homogeneiser une mise en valeur.</w:t>
+        <w:t>Consigne : appliquez le style Titre au titre principal, puis Titre 1 aux grandes parties, Titre 2 aux sous-parties et Normal au texte. Transformez l'énumération des outils en liste à puces, encadrez le titre principal (bordure + trame légère) et utilisez le pinceau (Reproduire la mise en forme) pour homogénéiser une mise en valeur.</w:t>
       </w:r>
     </w:p>
     <w:sectPr>

</xml_diff>